<commit_message>
feat: add AI Engineer resume variant and organize certifications directory
</commit_message>
<xml_diff>
--- a/output/en/Muhamad_Hendri_Febriansyah_Resume.docx
+++ b/output/en/Muhamad_Hendri_Febriansyah_Resume.docx
@@ -1957,7 +1957,86 @@
                 <w:color w:val="0F172A"/>
                 <w:sz w:val="20"/>
               </w:rPr>
-              <w:t>Belajar Analisis Data dengan Python | Dicoding Indonesia</w:t>
+              <w:t>Belajar Machine Learning untuk Pemula | Dicoding Indonesia / Google Developers</w:t>
+            </w:r>
+          </w:p>
+        </w:tc>
+        <w:tc>
+          <w:tcPr>
+            <w:tcW w:type="dxa" w:w="3168"/>
+            <w:tcMar>
+              <w:top w:w="0" w:type="dxa"/>
+              <w:bottom w:w="0" w:type="dxa"/>
+              <w:left w:w="0" w:type="dxa"/>
+              <w:right w:w="0" w:type="dxa"/>
+            </w:tcMar>
+          </w:tcPr>
+          <w:p>
+            <w:pPr>
+              <w:spacing w:before="40" w:after="20" w:line="252" w:lineRule="auto"/>
+              <w:jc w:val="right"/>
+            </w:pPr>
+            <w:r>
+              <w:rPr>
+                <w:rFonts w:ascii="Calibri" w:hAnsi="Calibri"/>
+                <w:i/>
+                <w:color w:val="475569"/>
+                <w:sz w:val="19"/>
+              </w:rPr>
+              <w:t>Aug 2024 – Aug 2027</w:t>
+            </w:r>
+          </w:p>
+        </w:tc>
+      </w:tr>
+    </w:tbl>
+    <w:p>
+      <w:pPr>
+        <w:spacing w:before="0" w:after="40"/>
+        <w:ind w:left="216"/>
+      </w:pPr>
+      <w:r>
+        <w:rPr>
+          <w:rFonts w:ascii="Calibri" w:hAnsi="Calibri"/>
+          <w:color w:val="475569"/>
+          <w:sz w:val="18"/>
+        </w:rPr>
+        <w:t>Core Focus: Supervised Learning, Neural Networks, CNN Image Classification, TensorFlow</w:t>
+      </w:r>
+    </w:p>
+    <w:tbl>
+      <w:tblPr>
+        <w:tblW w:type="auto" w:w="0"/>
+        <w:jc w:val="center"/>
+        <w:tblLayout w:type="fixed"/>
+        <w:tblLook w:firstColumn="1" w:firstRow="1" w:lastColumn="0" w:lastRow="0" w:noHBand="0" w:noVBand="1" w:val="04A0"/>
+      </w:tblPr>
+      <w:tblGrid>
+        <w:gridCol w:w="5400"/>
+        <w:gridCol w:w="5400"/>
+      </w:tblGrid>
+      <w:tr>
+        <w:tc>
+          <w:tcPr>
+            <w:tcW w:type="dxa" w:w="7632"/>
+            <w:tcMar>
+              <w:top w:w="0" w:type="dxa"/>
+              <w:bottom w:w="0" w:type="dxa"/>
+              <w:left w:w="0" w:type="dxa"/>
+              <w:right w:w="0" w:type="dxa"/>
+            </w:tcMar>
+          </w:tcPr>
+          <w:p>
+            <w:pPr>
+              <w:spacing w:before="40" w:after="20" w:line="252" w:lineRule="auto"/>
+            </w:pPr>
+            <w:r>
+              <w:rPr>
+                <w:rFonts w:ascii="Calibri" w:hAnsi="Calibri"/>
+                <w:b/>
+                <w:color w:val="0F172A"/>
+                <w:sz w:val="20"/>
+              </w:rPr>
+              <w:t>Belajar Analisis Data dengan Python | Dicoding Indonesia / Google Developers</w:t>
             </w:r>
           </w:p>
         </w:tc>
@@ -2000,7 +2079,7 @@
           <w:color w:val="475569"/>
           <w:sz w:val="18"/>
         </w:rPr>
-        <w:t>Core Focus: Data Wrangling, Exploratory Data Analysis, Visualization</w:t>
+        <w:t>Core Focus: Descriptive Statistics, Data Wrangling, Exploratory Data Analysis (EDA), Streamlit</w:t>
       </w:r>
     </w:p>
     <w:tbl>
@@ -2080,85 +2159,6 @@
           <w:sz w:val="18"/>
         </w:rPr>
         <w:t>Core Focus: Clean Architecture, MVVM Design Pattern, Room Database, App Security &amp; Certificate Pinning</w:t>
-      </w:r>
-    </w:p>
-    <w:tbl>
-      <w:tblPr>
-        <w:tblW w:type="auto" w:w="0"/>
-        <w:jc w:val="center"/>
-        <w:tblLayout w:type="fixed"/>
-        <w:tblLook w:firstColumn="1" w:firstRow="1" w:lastColumn="0" w:lastRow="0" w:noHBand="0" w:noVBand="1" w:val="04A0"/>
-      </w:tblPr>
-      <w:tblGrid>
-        <w:gridCol w:w="5400"/>
-        <w:gridCol w:w="5400"/>
-      </w:tblGrid>
-      <w:tr>
-        <w:tc>
-          <w:tcPr>
-            <w:tcW w:type="dxa" w:w="7632"/>
-            <w:tcMar>
-              <w:top w:w="0" w:type="dxa"/>
-              <w:bottom w:w="0" w:type="dxa"/>
-              <w:left w:w="0" w:type="dxa"/>
-              <w:right w:w="0" w:type="dxa"/>
-            </w:tcMar>
-          </w:tcPr>
-          <w:p>
-            <w:pPr>
-              <w:spacing w:before="40" w:after="20" w:line="252" w:lineRule="auto"/>
-            </w:pPr>
-            <w:r>
-              <w:rPr>
-                <w:rFonts w:ascii="Calibri" w:hAnsi="Calibri"/>
-                <w:b/>
-                <w:color w:val="0F172A"/>
-                <w:sz w:val="20"/>
-              </w:rPr>
-              <w:t>Belajar Android Jetpack Pro | Dicoding Indonesia</w:t>
-            </w:r>
-          </w:p>
-        </w:tc>
-        <w:tc>
-          <w:tcPr>
-            <w:tcW w:type="dxa" w:w="3168"/>
-            <w:tcMar>
-              <w:top w:w="0" w:type="dxa"/>
-              <w:bottom w:w="0" w:type="dxa"/>
-              <w:left w:w="0" w:type="dxa"/>
-              <w:right w:w="0" w:type="dxa"/>
-            </w:tcMar>
-          </w:tcPr>
-          <w:p>
-            <w:pPr>
-              <w:spacing w:before="40" w:after="20" w:line="252" w:lineRule="auto"/>
-              <w:jc w:val="right"/>
-            </w:pPr>
-            <w:r>
-              <w:rPr>
-                <w:rFonts w:ascii="Calibri" w:hAnsi="Calibri"/>
-                <w:i/>
-                <w:color w:val="475569"/>
-                <w:sz w:val="19"/>
-              </w:rPr>
-              <w:t>Dec 2020 – Dec 2023</w:t>
-            </w:r>
-          </w:p>
-        </w:tc>
-      </w:tr>
-    </w:tbl>
-    <w:p>
-      <w:pPr>
-        <w:spacing w:before="0" w:after="40"/>
-        <w:ind w:left="216"/>
-      </w:pPr>
-      <w:r>
-        <w:rPr>
-          <w:rFonts w:ascii="Calibri" w:hAnsi="Calibri"/>
-          <w:color w:val="475569"/>
-          <w:sz w:val="18"/>
-        </w:rPr>
-        <w:t>Core Focus: Android Architecture Components, LiveData, ViewModel, Room Library</w:t>
       </w:r>
     </w:p>
     <w:p>

</xml_diff>